<commit_message>
feat: Add contribution statement and refine vehicle recommendation report
</commit_message>
<xml_diff>
--- a/KR_Group_Project_Report_Vehicle_Recommendation.docx
+++ b/KR_Group_Project_Report_Vehicle_Recommendation.docx
@@ -13,16 +13,6 @@
           <w:szCs w:val="24"/>
         </w:rPr>
       </w:pPr>
-      <w:r>
-        <w:rPr>
-          <w:rFonts w:hint="eastAsia"/>
-          <w:b/>
-          <w:bCs/>
-          <w:sz w:val="28"/>
-          <w:szCs w:val="28"/>
-        </w:rPr>
-        <w:t>s</w:t>
-      </w:r>
       <w:r>
         <w:rPr>
           <w:b/>
@@ -422,23 +412,40 @@
         <w:t>hatchbacks are disqualified if there is high off-road capability is required.</w:t>
       </w:r>
       <w:r>
-        <w:t xml:space="preserve"> These conditions use Boolean logic (“and”, “or”, “not”) that easily map to Prolog rules and middle-layer abstractions such as </w:t>
-      </w:r>
+        <w:t xml:space="preserve"> These conditions use Boolean logic (“and”, “or”, “not”) that easily map to </w:t>
+      </w:r>
+      <w:proofErr w:type="spellStart"/>
+      <w:r>
+        <w:t>Prolog</w:t>
+      </w:r>
+      <w:proofErr w:type="spellEnd"/>
+      <w:r>
+        <w:t xml:space="preserve"> rules and middle-layer abstractions such as </w:t>
+      </w:r>
+      <w:proofErr w:type="spellStart"/>
       <w:r>
         <w:t>city_commuter</w:t>
       </w:r>
+      <w:proofErr w:type="spellEnd"/>
       <w:r>
         <w:t xml:space="preserve">, </w:t>
       </w:r>
-      <w:r>
-        <w:t xml:space="preserve">offroad_capable </w:t>
+      <w:proofErr w:type="spellStart"/>
+      <w:r>
+        <w:t>offroad_capable</w:t>
+      </w:r>
+      <w:proofErr w:type="spellEnd"/>
+      <w:r>
+        <w:t xml:space="preserve"> </w:t>
       </w:r>
       <w:r>
         <w:t xml:space="preserve">or </w:t>
       </w:r>
+      <w:proofErr w:type="spellStart"/>
       <w:r>
         <w:t>performance_oriented</w:t>
       </w:r>
+      <w:proofErr w:type="spellEnd"/>
       <w:r>
         <w:t>.</w:t>
       </w:r>
@@ -565,6 +572,7 @@
     </w:p>
     <w:p>
       <w:pPr>
+        <w:keepNext/>
         <w:spacing w:after="90"/>
         <w:jc w:val="center"/>
       </w:pPr>
@@ -573,9 +581,9 @@
           <w:noProof/>
         </w:rPr>
         <w:drawing>
-          <wp:inline distT="0" distB="0" distL="0" distR="0" wp14:anchorId="5C67E071" wp14:editId="78E0FDFD">
-            <wp:extent cx="3092450" cy="3402317"/>
-            <wp:effectExtent l="0" t="0" r="0" b="8255"/>
+          <wp:inline distT="0" distB="0" distL="0" distR="0" wp14:anchorId="5C67E071" wp14:editId="37945D79">
+            <wp:extent cx="2697271" cy="2967540"/>
+            <wp:effectExtent l="0" t="0" r="8255" b="4445"/>
             <wp:docPr id="1926667391" name="Picture 1"/>
             <wp:cNvGraphicFramePr>
               <a:graphicFrameLocks xmlns:a="http://schemas.openxmlformats.org/drawingml/2006/main" noChangeAspect="1"/>
@@ -596,7 +604,7 @@
                   <pic:spPr>
                     <a:xfrm>
                       <a:off x="0" y="0"/>
-                      <a:ext cx="3097719" cy="3408114"/>
+                      <a:ext cx="2704626" cy="2975632"/>
                     </a:xfrm>
                     <a:prstGeom prst="rect">
                       <a:avLst/>
@@ -611,6 +619,26 @@
     </w:p>
     <w:p>
       <w:pPr>
+        <w:pStyle w:val="Caption"/>
+        <w:jc w:val="center"/>
+      </w:pPr>
+      <w:r>
+        <w:t xml:space="preserve">Figure </w:t>
+      </w:r>
+      <w:fldSimple w:instr=" SEQ Figure \* ARABIC ">
+        <w:r>
+          <w:rPr>
+            <w:noProof/>
+          </w:rPr>
+          <w:t>1</w:t>
+        </w:r>
+      </w:fldSimple>
+      <w:r>
+        <w:t xml:space="preserve"> Layer Flowchart</w:t>
+      </w:r>
+    </w:p>
+    <w:p>
+      <w:pPr>
         <w:spacing w:after="90"/>
         <w:rPr>
           <w:b/>
@@ -673,8 +701,13 @@
         </w:numPr>
         <w:spacing w:after="90"/>
       </w:pPr>
-      <w:r>
-        <w:t>recommend('Pure Electric Commuter (EV)'</w:t>
+      <w:proofErr w:type="gramStart"/>
+      <w:r>
+        <w:t>recommend(</w:t>
+      </w:r>
+      <w:proofErr w:type="gramEnd"/>
+      <w:r>
+        <w:t>'Pure Electric Commuter (EV)'</w:t>
       </w:r>
       <w:r>
         <w:t>)</w:t>
@@ -689,8 +722,13 @@
         </w:numPr>
         <w:spacing w:after="90"/>
       </w:pPr>
-      <w:r>
-        <w:t>recommend('Compact Hatchback')</w:t>
+      <w:proofErr w:type="gramStart"/>
+      <w:r>
+        <w:t>recommend(</w:t>
+      </w:r>
+      <w:proofErr w:type="gramEnd"/>
+      <w:r>
+        <w:t>'Compact Hatchback')</w:t>
       </w:r>
     </w:p>
     <w:p>
@@ -715,8 +753,13 @@
         </w:numPr>
         <w:spacing w:after="90"/>
       </w:pPr>
-      <w:r>
-        <w:t>recommend('Wagon / Estate')</w:t>
+      <w:proofErr w:type="gramStart"/>
+      <w:r>
+        <w:t>recommend(</w:t>
+      </w:r>
+      <w:proofErr w:type="gramEnd"/>
+      <w:r>
+        <w:t>'Wagon / Estate')</w:t>
       </w:r>
     </w:p>
     <w:p>
@@ -728,8 +771,13 @@
         </w:numPr>
         <w:spacing w:after="90"/>
       </w:pPr>
-      <w:r>
-        <w:t>recommend('MPV / Minivan')</w:t>
+      <w:proofErr w:type="gramStart"/>
+      <w:r>
+        <w:t>recommend(</w:t>
+      </w:r>
+      <w:proofErr w:type="gramEnd"/>
+      <w:r>
+        <w:t>'MPV / Minivan')</w:t>
       </w:r>
     </w:p>
     <w:p>
@@ -741,8 +789,13 @@
         </w:numPr>
         <w:spacing w:after="90"/>
       </w:pPr>
-      <w:r>
-        <w:t>recommend('Pickup Truck')</w:t>
+      <w:proofErr w:type="gramStart"/>
+      <w:r>
+        <w:t>recommend(</w:t>
+      </w:r>
+      <w:proofErr w:type="gramEnd"/>
+      <w:r>
+        <w:t>'Pickup Truck')</w:t>
       </w:r>
     </w:p>
     <w:p>
@@ -754,8 +807,13 @@
         </w:numPr>
         <w:spacing w:after="90"/>
       </w:pPr>
-      <w:r>
-        <w:t>recommend('Coupe / Sports Car')</w:t>
+      <w:proofErr w:type="gramStart"/>
+      <w:r>
+        <w:t>recommend(</w:t>
+      </w:r>
+      <w:proofErr w:type="gramEnd"/>
+      <w:r>
+        <w:t>'Coupe / Sports Car')</w:t>
       </w:r>
     </w:p>
     <w:p>
@@ -831,8 +889,21 @@
         </w:numPr>
         <w:spacing w:after="90"/>
       </w:pPr>
-      <w:r>
-        <w:t>it_is(city_commuter)</w:t>
+      <w:proofErr w:type="spellStart"/>
+      <w:r>
+        <w:t>it_is</w:t>
+      </w:r>
+      <w:proofErr w:type="spellEnd"/>
+      <w:r>
+        <w:t>(</w:t>
+      </w:r>
+      <w:proofErr w:type="spellStart"/>
+      <w:r>
+        <w:t>city_commuter</w:t>
+      </w:r>
+      <w:proofErr w:type="spellEnd"/>
+      <w:r>
+        <w:t>)</w:t>
       </w:r>
     </w:p>
     <w:p>
@@ -844,8 +915,21 @@
         </w:numPr>
         <w:spacing w:after="90"/>
       </w:pPr>
-      <w:r>
-        <w:t>it_is(large_family)</w:t>
+      <w:proofErr w:type="spellStart"/>
+      <w:r>
+        <w:t>it_is</w:t>
+      </w:r>
+      <w:proofErr w:type="spellEnd"/>
+      <w:r>
+        <w:t>(</w:t>
+      </w:r>
+      <w:proofErr w:type="spellStart"/>
+      <w:r>
+        <w:t>large_family</w:t>
+      </w:r>
+      <w:proofErr w:type="spellEnd"/>
+      <w:r>
+        <w:t>)</w:t>
       </w:r>
     </w:p>
     <w:p>
@@ -857,8 +941,21 @@
         </w:numPr>
         <w:spacing w:after="90"/>
       </w:pPr>
-      <w:r>
-        <w:t>it_is(offroad_capable)</w:t>
+      <w:proofErr w:type="spellStart"/>
+      <w:r>
+        <w:t>it_is</w:t>
+      </w:r>
+      <w:proofErr w:type="spellEnd"/>
+      <w:r>
+        <w:t>(</w:t>
+      </w:r>
+      <w:proofErr w:type="spellStart"/>
+      <w:r>
+        <w:t>offroad_capable</w:t>
+      </w:r>
+      <w:proofErr w:type="spellEnd"/>
+      <w:r>
+        <w:t>)</w:t>
       </w:r>
     </w:p>
     <w:p>
@@ -870,8 +967,21 @@
         </w:numPr>
         <w:spacing w:after="90"/>
       </w:pPr>
-      <w:r>
-        <w:t>it_is(heavy_hauler)</w:t>
+      <w:proofErr w:type="spellStart"/>
+      <w:r>
+        <w:t>it_is</w:t>
+      </w:r>
+      <w:proofErr w:type="spellEnd"/>
+      <w:r>
+        <w:t>(</w:t>
+      </w:r>
+      <w:proofErr w:type="spellStart"/>
+      <w:r>
+        <w:t>heavy_hauler</w:t>
+      </w:r>
+      <w:proofErr w:type="spellEnd"/>
+      <w:r>
+        <w:t>)</w:t>
       </w:r>
     </w:p>
     <w:p>
@@ -883,8 +993,21 @@
         </w:numPr>
         <w:spacing w:after="90"/>
       </w:pPr>
-      <w:r>
-        <w:t>it_is(extra_cargo_need)</w:t>
+      <w:proofErr w:type="spellStart"/>
+      <w:r>
+        <w:t>it_is</w:t>
+      </w:r>
+      <w:proofErr w:type="spellEnd"/>
+      <w:r>
+        <w:t>(</w:t>
+      </w:r>
+      <w:proofErr w:type="spellStart"/>
+      <w:r>
+        <w:t>extra_cargo_need</w:t>
+      </w:r>
+      <w:proofErr w:type="spellEnd"/>
+      <w:r>
+        <w:t>)</w:t>
       </w:r>
     </w:p>
     <w:p>
@@ -896,8 +1019,21 @@
         </w:numPr>
         <w:spacing w:after="90"/>
       </w:pPr>
-      <w:r>
-        <w:t>it_is(performance_oriented)</w:t>
+      <w:proofErr w:type="spellStart"/>
+      <w:r>
+        <w:t>it_is</w:t>
+      </w:r>
+      <w:proofErr w:type="spellEnd"/>
+      <w:r>
+        <w:t>(</w:t>
+      </w:r>
+      <w:proofErr w:type="spellStart"/>
+      <w:r>
+        <w:t>performance_oriented</w:t>
+      </w:r>
+      <w:proofErr w:type="spellEnd"/>
+      <w:r>
+        <w:t>)</w:t>
       </w:r>
     </w:p>
     <w:p>
@@ -909,8 +1045,21 @@
         </w:numPr>
         <w:spacing w:after="90"/>
       </w:pPr>
-      <w:r>
-        <w:t>it_is(daily_passenger)</w:t>
+      <w:proofErr w:type="spellStart"/>
+      <w:r>
+        <w:t>it_is</w:t>
+      </w:r>
+      <w:proofErr w:type="spellEnd"/>
+      <w:r>
+        <w:t>(</w:t>
+      </w:r>
+      <w:proofErr w:type="spellStart"/>
+      <w:r>
+        <w:t>daily_passenger</w:t>
+      </w:r>
+      <w:proofErr w:type="spellEnd"/>
+      <w:r>
+        <w:t>)</w:t>
       </w:r>
     </w:p>
     <w:p>
@@ -953,7 +1102,15 @@
         <w:spacing w:after="90"/>
       </w:pPr>
       <w:r>
-        <w:t>It uses pref/1 to represent user preferences as logical conditions, while verify/1 checks whether the user has answered the corresponding question and stores the answer.</w:t>
+        <w:t xml:space="preserve">It uses </w:t>
+      </w:r>
+      <w:proofErr w:type="spellStart"/>
+      <w:r>
+        <w:t>pref</w:t>
+      </w:r>
+      <w:proofErr w:type="spellEnd"/>
+      <w:r>
+        <w:t>/1 to represent user preferences as logical conditions, while verify/1 checks whether the user has answered the corresponding question and stores the answer.</w:t>
       </w:r>
     </w:p>
     <w:p>
@@ -978,8 +1135,21 @@
         </w:numPr>
         <w:spacing w:after="90"/>
       </w:pPr>
-      <w:r>
-        <w:t>pref(pure_ev)</w:t>
+      <w:proofErr w:type="spellStart"/>
+      <w:r>
+        <w:t>pref</w:t>
+      </w:r>
+      <w:proofErr w:type="spellEnd"/>
+      <w:r>
+        <w:t>(</w:t>
+      </w:r>
+      <w:proofErr w:type="spellStart"/>
+      <w:r>
+        <w:t>pure_ev</w:t>
+      </w:r>
+      <w:proofErr w:type="spellEnd"/>
+      <w:r>
+        <w:t>)</w:t>
       </w:r>
     </w:p>
     <w:p>
@@ -1028,7 +1198,15 @@
         <w:t xml:space="preserve">is </w:t>
       </w:r>
       <w:r>
-        <w:t>used to manage local state by checking if a question has already been answered (yes/1 or no/1). If not answered, it triggers the asking layer and stores the result using assertz/1 to ensure questions are never repeated during a session.</w:t>
+        <w:t xml:space="preserve">used to manage local state by checking if a question has already been answered (yes/1 or no/1). If not answered, it triggers the asking layer and stores the result using </w:t>
+      </w:r>
+      <w:proofErr w:type="spellStart"/>
+      <w:r>
+        <w:t>assertz</w:t>
+      </w:r>
+      <w:proofErr w:type="spellEnd"/>
+      <w:r>
+        <w:t>/1 to ensure questions are never repeated during a session.</w:t>
       </w:r>
     </w:p>
     <w:p>
@@ -1077,7 +1255,15 @@
         <w:t xml:space="preserve">is </w:t>
       </w:r>
       <w:r>
-        <w:t>used to handle terminal I/O, displays formatted prompts, safely reads raw string inputs via read_line_to_string, and validate y/n responses.</w:t>
+        <w:t xml:space="preserve">used to handle terminal I/O, displays formatted prompts, safely reads raw string inputs via </w:t>
+      </w:r>
+      <w:proofErr w:type="spellStart"/>
+      <w:r>
+        <w:t>read_line_to_string</w:t>
+      </w:r>
+      <w:proofErr w:type="spellEnd"/>
+      <w:r>
+        <w:t>, and validate y/n responses.</w:t>
       </w:r>
     </w:p>
     <w:p>
@@ -1192,7 +1378,15 @@
         <w:t>, which is messy.</w:t>
       </w:r>
       <w:r>
-        <w:t xml:space="preserve"> So, when we introduce it_is/1 middle layers allowed us to abstract vehicle features cleanly and reuse them across multiple distinct vehicle categories.</w:t>
+        <w:t xml:space="preserve"> So, when we introduce </w:t>
+      </w:r>
+      <w:proofErr w:type="spellStart"/>
+      <w:r>
+        <w:t>it_is</w:t>
+      </w:r>
+      <w:proofErr w:type="spellEnd"/>
+      <w:r>
+        <w:t>/1 middle layers allowed us to abstract vehicle features cleanly and reuse them across multiple distinct vehicle categories.</w:t>
       </w:r>
     </w:p>
     <w:p>
@@ -1233,7 +1427,39 @@
         <w:spacing w:after="200"/>
       </w:pPr>
       <w:r>
-        <w:t>In our architecture design, the modularity of the middle layers (it_is/1 and pref/1) means that we would not have to rewrite the question or memory tiers. However, because of Prolog’s top-down evaluation order and rule shadowing, adding a new outcome requires careful placement. We must insert the new recommend/1 rule at the correct priority level, update negative exclusions (\+) in overlapping rules to prevent shadowing, and synchronize the explanation metadata, such as description, tradeoff, and rationale, to maintain consistency.</w:t>
+        <w:t>In our architecture design, the modularity of the middle layers (</w:t>
+      </w:r>
+      <w:proofErr w:type="spellStart"/>
+      <w:r>
+        <w:t>it_is</w:t>
+      </w:r>
+      <w:proofErr w:type="spellEnd"/>
+      <w:r>
+        <w:t xml:space="preserve">/1 and </w:t>
+      </w:r>
+      <w:proofErr w:type="spellStart"/>
+      <w:r>
+        <w:t>pref</w:t>
+      </w:r>
+      <w:proofErr w:type="spellEnd"/>
+      <w:r>
+        <w:t xml:space="preserve">/1) means that we would not have to rewrite the question or memory tiers. However, because of </w:t>
+      </w:r>
+      <w:proofErr w:type="spellStart"/>
+      <w:r>
+        <w:t>Prolog’s</w:t>
+      </w:r>
+      <w:proofErr w:type="spellEnd"/>
+      <w:r>
+        <w:t xml:space="preserve"> top-down evaluation order and rule shadowing, adding a new outcome requires careful placement. We must insert the new recommend/1 rule at the correct priority level, update negative exclusions (\+) in overlapping rules to prevent shadowing, and synchronize the explanation metadata, such as description, </w:t>
+      </w:r>
+      <w:proofErr w:type="spellStart"/>
+      <w:r>
+        <w:t>tradeoff</w:t>
+      </w:r>
+      <w:proofErr w:type="spellEnd"/>
+      <w:r>
+        <w:t>, and rationale, to maintain consistency.</w:t>
       </w:r>
     </w:p>
     <w:p>
@@ -1289,7 +1515,31 @@
         <w:t xml:space="preserve"> </w:t>
       </w:r>
       <w:r>
-        <w:t>we might need to add negative constraints, such as \+ it_is(new_features), to closely related preceding rules because Prolog evaluates rules from top to bottom, and rule shadowing can cause them to accidentally intercept matches intended for the new outcome</w:t>
+        <w:t xml:space="preserve">we might need to add negative constraints, such as \+ </w:t>
+      </w:r>
+      <w:proofErr w:type="spellStart"/>
+      <w:r>
+        <w:t>it_is</w:t>
+      </w:r>
+      <w:proofErr w:type="spellEnd"/>
+      <w:r>
+        <w:t>(</w:t>
+      </w:r>
+      <w:proofErr w:type="spellStart"/>
+      <w:r>
+        <w:t>new_features</w:t>
+      </w:r>
+      <w:proofErr w:type="spellEnd"/>
+      <w:r>
+        <w:t xml:space="preserve">), to closely related preceding rules because </w:t>
+      </w:r>
+      <w:proofErr w:type="spellStart"/>
+      <w:r>
+        <w:t>Prolog</w:t>
+      </w:r>
+      <w:proofErr w:type="spellEnd"/>
+      <w:r>
+        <w:t xml:space="preserve"> evaluates rules from top to bottom, and rule shadowing can cause them to accidentally intercept matches intended for the new outcome</w:t>
       </w:r>
     </w:p>
     <w:p>
@@ -1310,7 +1560,23 @@
         <w:t xml:space="preserve"> </w:t>
       </w:r>
       <w:r>
-        <w:t>New description/2, tradeoff/2, rationale/2, and matching reason_text/3 entries (along with consistent store/2 clauses) for any new outcome would be necessary to maintain full synchronization across the explanation pipeline</w:t>
+        <w:t xml:space="preserve">New description/2, </w:t>
+      </w:r>
+      <w:proofErr w:type="spellStart"/>
+      <w:r>
+        <w:t>tradeoff</w:t>
+      </w:r>
+      <w:proofErr w:type="spellEnd"/>
+      <w:r>
+        <w:t xml:space="preserve">/2, rationale/2, and matching </w:t>
+      </w:r>
+      <w:proofErr w:type="spellStart"/>
+      <w:r>
+        <w:t>reason_text</w:t>
+      </w:r>
+      <w:proofErr w:type="spellEnd"/>
+      <w:r>
+        <w:t>/3 entries (along with consistent store/2 clauses) for any new outcome would be necessary to maintain full synchronization across the explanation pipeline</w:t>
       </w:r>
       <w:r>
         <w:t>.</w:t>
@@ -1318,6 +1584,7 @@
     </w:p>
     <w:p>
       <w:pPr>
+        <w:keepNext/>
         <w:pBdr>
           <w:bottom w:val="dotted" w:sz="4" w:space="0" w:color="C9C9D2"/>
         </w:pBdr>
@@ -1330,9 +1597,9 @@
         </w:rPr>
         <w:lastRenderedPageBreak/>
         <w:drawing>
-          <wp:inline distT="0" distB="0" distL="0" distR="0" wp14:anchorId="3E256577" wp14:editId="2B11FA65">
-            <wp:extent cx="5413104" cy="8595360"/>
-            <wp:effectExtent l="0" t="0" r="0" b="0"/>
+          <wp:inline distT="0" distB="0" distL="0" distR="0" wp14:anchorId="3E256577" wp14:editId="7B828194">
+            <wp:extent cx="5351047" cy="8496822"/>
+            <wp:effectExtent l="0" t="0" r="2540" b="0"/>
             <wp:docPr id="81731609" name="Picture 1"/>
             <wp:cNvGraphicFramePr>
               <a:graphicFrameLocks xmlns:a="http://schemas.openxmlformats.org/drawingml/2006/main" noChangeAspect="1"/>
@@ -1353,7 +1620,7 @@
                   <pic:spPr>
                     <a:xfrm>
                       <a:off x="0" y="0"/>
-                      <a:ext cx="5414792" cy="8598041"/>
+                      <a:ext cx="5353327" cy="8500442"/>
                     </a:xfrm>
                     <a:prstGeom prst="rect">
                       <a:avLst/>
@@ -1368,9 +1635,27 @@
     </w:p>
     <w:p>
       <w:pPr>
+        <w:pStyle w:val="Caption"/>
+        <w:jc w:val="center"/>
+      </w:pPr>
+      <w:r>
+        <w:t xml:space="preserve">Figure </w:t>
+      </w:r>
+      <w:fldSimple w:instr=" SEQ Figure \* ARABIC ">
+        <w:r>
+          <w:rPr>
+            <w:noProof/>
+          </w:rPr>
+          <w:t>2</w:t>
+        </w:r>
+      </w:fldSimple>
+      <w:r>
+        <w:t xml:space="preserve"> System Flowchart</w:t>
+      </w:r>
+    </w:p>
+    <w:p>
+      <w:pPr>
         <w:spacing w:before="270" w:after="70"/>
-      </w:pPr>
-      <w:r>
         <w:rPr>
           <w:b/>
           <w:bCs/>
@@ -1378,23 +1663,255 @@
           <w:sz w:val="26"/>
           <w:szCs w:val="26"/>
         </w:rPr>
+      </w:pPr>
+      <w:r>
+        <w:rPr>
+          <w:b/>
+          <w:bCs/>
+          <w:color w:val="1E2761"/>
+          <w:sz w:val="26"/>
+          <w:szCs w:val="26"/>
+        </w:rPr>
         <w:lastRenderedPageBreak/>
-        <w:t>3. Two decisions we argued about</w:t>
-      </w:r>
-      <w:r>
-        <w:rPr>
-          <w:color w:val="6A6A7A"/>
-          <w:sz w:val="18"/>
-          <w:szCs w:val="18"/>
-        </w:rPr>
-        <w:t xml:space="preserve">   7 marks · about three quarters of a page</w:t>
-      </w:r>
-    </w:p>
-    <w:p>
-      <w:pPr>
-        <w:spacing w:after="90"/>
-      </w:pPr>
-      <w:r>
+        <w:t xml:space="preserve">3. Two decisions we argued </w:t>
+      </w:r>
+    </w:p>
+    <w:p>
+      <w:pPr>
+        <w:spacing w:before="270" w:after="70"/>
+      </w:pPr>
+    </w:p>
+    <w:p>
+      <w:pPr>
+        <w:spacing w:after="110"/>
+      </w:pPr>
+      <w:r>
+        <w:rPr>
+          <w:b/>
+          <w:bCs/>
+        </w:rPr>
+        <w:t xml:space="preserve">Decision 1: </w:t>
+      </w:r>
+      <w:r>
+        <w:rPr>
+          <w:b/>
+          <w:bCs/>
+          <w:u w:val="single"/>
+        </w:rPr>
+        <w:t>What to do when two rules both fit — rely on rule order, or make every rule exclusive?</w:t>
+      </w:r>
+    </w:p>
+    <w:p>
+      <w:pPr>
+        <w:pBdr>
+          <w:bottom w:val="dotted" w:sz="4" w:space="0" w:color="C9C9D2"/>
+        </w:pBdr>
+        <w:spacing w:after="200"/>
+        <w:rPr>
+          <w:rFonts w:ascii="Times New Roman" w:hAnsi="Times New Roman" w:cs="Times New Roman"/>
+        </w:rPr>
+      </w:pPr>
+      <w:r>
+        <w:rPr>
+          <w:rFonts w:ascii="Times New Roman" w:hAnsi="Times New Roman" w:cs="Times New Roman"/>
+        </w:rPr>
+        <w:t>Side A wanted one broad question (“Do you need high cargo capacity or heavy towing capability?”), because it keeps the consultation short and both needs point toward larger, stronger vehicles.</w:t>
+      </w:r>
+    </w:p>
+    <w:p>
+      <w:pPr>
+        <w:pBdr>
+          <w:bottom w:val="dotted" w:sz="4" w:space="0" w:color="C9C9D2"/>
+        </w:pBdr>
+        <w:spacing w:after="200"/>
+        <w:rPr>
+          <w:rFonts w:ascii="Times New Roman" w:hAnsi="Times New Roman" w:cs="Times New Roman"/>
+        </w:rPr>
+      </w:pPr>
+      <w:r>
+        <w:rPr>
+          <w:rFonts w:ascii="Times New Roman" w:hAnsi="Times New Roman" w:cs="Times New Roman"/>
+        </w:rPr>
+        <w:t>Side B wanted two narrow questions, one for cargo space and one for towing, because they lead to different vehicles: a wagon gives cargo space but is not built for towing, while a pickup truck is built for both.</w:t>
+      </w:r>
+    </w:p>
+    <w:p>
+      <w:pPr>
+        <w:pBdr>
+          <w:bottom w:val="dotted" w:sz="4" w:space="0" w:color="C9C9D2"/>
+        </w:pBdr>
+        <w:spacing w:after="200"/>
+        <w:rPr>
+          <w:rFonts w:ascii="Times New Roman" w:hAnsi="Times New Roman" w:cs="Times New Roman"/>
+        </w:rPr>
+      </w:pPr>
+      <w:r>
+        <w:rPr>
+          <w:rFonts w:ascii="Times New Roman" w:hAnsi="Times New Roman" w:cs="Times New Roman"/>
+        </w:rPr>
+        <w:t>We chose the single broad question to keep the number of questions at six, and reused its answer through a middle-layer concept (</w:t>
+      </w:r>
+      <w:proofErr w:type="spellStart"/>
+      <w:r>
+        <w:rPr>
+          <w:rFonts w:ascii="Times New Roman" w:hAnsi="Times New Roman" w:cs="Times New Roman"/>
+        </w:rPr>
+        <w:t>extra_cargo_need</w:t>
+      </w:r>
+      <w:proofErr w:type="spellEnd"/>
+      <w:r>
+        <w:rPr>
+          <w:rFonts w:ascii="Times New Roman" w:hAnsi="Times New Roman" w:cs="Times New Roman"/>
+        </w:rPr>
+        <w:t xml:space="preserve"> is derived from </w:t>
+      </w:r>
+      <w:proofErr w:type="spellStart"/>
+      <w:r>
+        <w:rPr>
+          <w:rFonts w:ascii="Times New Roman" w:hAnsi="Times New Roman" w:cs="Times New Roman"/>
+        </w:rPr>
+        <w:t>heavy_hauler</w:t>
+      </w:r>
+      <w:proofErr w:type="spellEnd"/>
+      <w:r>
+        <w:rPr>
+          <w:rFonts w:ascii="Times New Roman" w:hAnsi="Times New Roman" w:cs="Times New Roman"/>
+        </w:rPr>
+        <w:t>). The trade-off is a known weakness: a user who needs heavy towing but not off-road driving is recommended a Wagon / Estate, which suits extra cargo but not towing. With more time we would split the question into two, so that Wagon and Pickup Truck could be told apart properly.</w:t>
+      </w:r>
+    </w:p>
+    <w:p>
+      <w:pPr>
+        <w:pBdr>
+          <w:bottom w:val="dotted" w:sz="4" w:space="0" w:color="C9C9D2"/>
+        </w:pBdr>
+        <w:spacing w:after="200"/>
+      </w:pPr>
+    </w:p>
+    <w:p>
+      <w:pPr>
+        <w:spacing w:after="110"/>
+      </w:pPr>
+      <w:r>
+        <w:rPr>
+          <w:b/>
+          <w:bCs/>
+        </w:rPr>
+        <w:t xml:space="preserve">Decision 2: </w:t>
+      </w:r>
+      <w:r>
+        <w:rPr>
+          <w:b/>
+          <w:bCs/>
+          <w:u w:val="single"/>
+        </w:rPr>
+        <w:t>Keep questions broad or add specific utility traits</w:t>
+      </w:r>
+      <w:r>
+        <w:rPr>
+          <w:b/>
+          <w:bCs/>
+          <w:u w:val="single"/>
+        </w:rPr>
+        <w:t>?</w:t>
+      </w:r>
+    </w:p>
+    <w:p>
+      <w:pPr>
+        <w:pBdr>
+          <w:bottom w:val="dotted" w:sz="4" w:space="0" w:color="C9C9D2"/>
+        </w:pBdr>
+        <w:spacing w:after="200"/>
+        <w:rPr>
+          <w:rFonts w:ascii="Times New Roman" w:hAnsi="Times New Roman" w:cs="Times New Roman"/>
+        </w:rPr>
+      </w:pPr>
+      <w:r>
+        <w:rPr>
+          <w:rFonts w:ascii="Times New Roman" w:hAnsi="Times New Roman" w:cs="Times New Roman"/>
+        </w:rPr>
+        <w:t>Side A wanted to keep the questions broad to maintain six questions and keep the consultation short. Broad questions are easier for users to answer and reduce the complexity of the recommendation system.</w:t>
+      </w:r>
+    </w:p>
+    <w:p>
+      <w:pPr>
+        <w:pBdr>
+          <w:bottom w:val="dotted" w:sz="4" w:space="0" w:color="C9C9D2"/>
+        </w:pBdr>
+        <w:spacing w:after="200"/>
+        <w:rPr>
+          <w:rFonts w:ascii="Times New Roman" w:hAnsi="Times New Roman" w:cs="Times New Roman"/>
+        </w:rPr>
+      </w:pPr>
+      <w:r>
+        <w:rPr>
+          <w:rFonts w:ascii="Times New Roman" w:hAnsi="Times New Roman" w:cs="Times New Roman"/>
+        </w:rPr>
+        <w:t xml:space="preserve">Side B wanted to add specific utility traits, such as </w:t>
+      </w:r>
+      <w:proofErr w:type="spellStart"/>
+      <w:r>
+        <w:rPr>
+          <w:rFonts w:ascii="Times New Roman" w:hAnsi="Times New Roman" w:cs="Times New Roman"/>
+        </w:rPr>
+        <w:t>higher_seating</w:t>
+      </w:r>
+      <w:proofErr w:type="spellEnd"/>
+      <w:r>
+        <w:rPr>
+          <w:rFonts w:ascii="Times New Roman" w:hAnsi="Times New Roman" w:cs="Times New Roman"/>
+        </w:rPr>
+        <w:t xml:space="preserve"> and </w:t>
+      </w:r>
+      <w:proofErr w:type="spellStart"/>
+      <w:r>
+        <w:rPr>
+          <w:rFonts w:ascii="Times New Roman" w:hAnsi="Times New Roman" w:cs="Times New Roman"/>
+        </w:rPr>
+        <w:t>versatile_cargo</w:t>
+      </w:r>
+      <w:proofErr w:type="spellEnd"/>
+      <w:r>
+        <w:rPr>
+          <w:rFonts w:ascii="Times New Roman" w:hAnsi="Times New Roman" w:cs="Times New Roman"/>
+        </w:rPr>
+        <w:t>, to better differentiate SUVs from Sedans and Wagons. For example, an SUV is suitable for users who prefer higher seating, while a Wagon is more suitable for users who need versatile cargo space.</w:t>
+      </w:r>
+    </w:p>
+    <w:p>
+      <w:pPr>
+        <w:pBdr>
+          <w:bottom w:val="dotted" w:sz="4" w:space="0" w:color="C9C9D2"/>
+        </w:pBdr>
+        <w:spacing w:after="200"/>
+        <w:rPr>
+          <w:rFonts w:ascii="Times New Roman" w:hAnsi="Times New Roman" w:cs="Times New Roman"/>
+        </w:rPr>
+      </w:pPr>
+      <w:r>
+        <w:rPr>
+          <w:rFonts w:ascii="Times New Roman" w:hAnsi="Times New Roman" w:cs="Times New Roman"/>
+        </w:rPr>
+        <w:t>We chose to keep the questions broad to maintain the six-question limit and keep the system simple. However, this creates a known weakness because the system may recommend a Sedan or Wagon when an SUV would better match the user's preferences. With more time, we would add specific utility questions to distinguish these vehicle types more accurately</w:t>
+      </w:r>
+      <w:r>
+        <w:rPr>
+          <w:rFonts w:ascii="Times New Roman" w:hAnsi="Times New Roman" w:cs="Times New Roman"/>
+        </w:rPr>
+        <w:t>.</w:t>
+      </w:r>
+    </w:p>
+    <w:p>
+      <w:pPr>
+        <w:pBdr>
+          <w:bottom w:val="dotted" w:sz="4" w:space="0" w:color="C9C9D2"/>
+        </w:pBdr>
+        <w:spacing w:after="200"/>
+      </w:pPr>
+    </w:p>
+    <w:p>
+      <w:pPr>
+        <w:spacing w:before="270" w:after="70"/>
         <w:rPr>
           <w:i/>
           <w:iCs/>
@@ -1402,199 +1919,6 @@
           <w:sz w:val="19"/>
           <w:szCs w:val="19"/>
         </w:rPr>
-        <w:t>Pick two real disagreements. For each, give both sides and say how you settled it. If a decision had an obvious answer, it is not one of these.</w:t>
-      </w:r>
-    </w:p>
-    <w:p>
-      <w:pPr>
-        <w:spacing w:after="90"/>
-      </w:pPr>
-      <w:r>
-        <w:rPr>
-          <w:i/>
-          <w:iCs/>
-          <w:color w:val="6A6A7A"/>
-          <w:sz w:val="19"/>
-          <w:szCs w:val="19"/>
-        </w:rPr>
-        <w:t>Things groups commonly argue about: how fine-grained the outcomes should be; whether to ask one broad question or three narrow ones; what to do when two rules both fit; whether a near-miss should be reported or treated as a failure.</w:t>
-      </w:r>
-    </w:p>
-    <w:p>
-      <w:pPr>
-        <w:spacing w:after="110"/>
-      </w:pPr>
-      <w:r>
-        <w:rPr>
-          <w:b/>
-          <w:bCs/>
-        </w:rPr>
-        <w:t xml:space="preserve">Decision 1: </w:t>
-      </w:r>
-      <w:r>
-        <w:rPr>
-          <w:b/>
-          <w:bCs/>
-          <w:u w:val="single"/>
-        </w:rPr>
-        <w:t>What to do when two rules both fit — rely on rule order, or make every rule exclusive?</w:t>
-      </w:r>
-    </w:p>
-    <w:p>
-      <w:pPr>
-        <w:pBdr>
-          <w:bottom w:val="dotted" w:sz="4" w:space="0" w:color="C9C9D2"/>
-        </w:pBdr>
-        <w:spacing w:after="200"/>
-        <w:rPr>
-          <w:rFonts w:ascii="Times New Roman" w:hAnsi="Times New Roman" w:cs="Times New Roman"/>
-        </w:rPr>
-      </w:pPr>
-      <w:r>
-        <w:rPr>
-          <w:rFonts w:ascii="Times New Roman" w:hAnsi="Times New Roman" w:cs="Times New Roman"/>
-        </w:rPr>
-        <w:t>Side A wanted one broad question (“Do you need high cargo capacity or heavy towing capability?”), because it keeps the consultation short and both needs point toward larger, stronger vehicles.</w:t>
-      </w:r>
-    </w:p>
-    <w:p>
-      <w:pPr>
-        <w:pBdr>
-          <w:bottom w:val="dotted" w:sz="4" w:space="0" w:color="C9C9D2"/>
-        </w:pBdr>
-        <w:spacing w:after="200"/>
-        <w:rPr>
-          <w:rFonts w:ascii="Times New Roman" w:hAnsi="Times New Roman" w:cs="Times New Roman"/>
-        </w:rPr>
-      </w:pPr>
-      <w:r>
-        <w:rPr>
-          <w:rFonts w:ascii="Times New Roman" w:hAnsi="Times New Roman" w:cs="Times New Roman"/>
-        </w:rPr>
-        <w:t>Side B wanted two narrow questions, one for cargo space and one for towing, because they lead to different vehicles: a wagon gives cargo space but is not built for towing, while a pickup truck is built for both.</w:t>
-      </w:r>
-    </w:p>
-    <w:p>
-      <w:pPr>
-        <w:pBdr>
-          <w:bottom w:val="dotted" w:sz="4" w:space="0" w:color="C9C9D2"/>
-        </w:pBdr>
-        <w:spacing w:after="200"/>
-        <w:rPr>
-          <w:rFonts w:ascii="Times New Roman" w:hAnsi="Times New Roman" w:cs="Times New Roman"/>
-        </w:rPr>
-      </w:pPr>
-      <w:r>
-        <w:rPr>
-          <w:rFonts w:ascii="Times New Roman" w:hAnsi="Times New Roman" w:cs="Times New Roman"/>
-        </w:rPr>
-        <w:t>We chose the single broad question to keep the number of questions at six, and reused its answer through a middle-layer concept (extra_cargo_need is derived from heavy_hauler). The trade-off is a known weakness: a user who needs heavy towing but not off-road driving is recommended a Wagon / Estate, which suits extra cargo but not towing. With more time we would split the question into two, so that Wagon and Pickup Truck could be told apart properly.</w:t>
-      </w:r>
-    </w:p>
-    <w:p>
-      <w:pPr>
-        <w:pBdr>
-          <w:bottom w:val="dotted" w:sz="4" w:space="0" w:color="C9C9D2"/>
-        </w:pBdr>
-        <w:spacing w:after="200"/>
-      </w:pPr>
-    </w:p>
-    <w:p>
-      <w:pPr>
-        <w:spacing w:after="110"/>
-      </w:pPr>
-      <w:r>
-        <w:rPr>
-          <w:b/>
-          <w:bCs/>
-        </w:rPr>
-        <w:t xml:space="preserve">Decision 2: </w:t>
-      </w:r>
-      <w:r>
-        <w:rPr>
-          <w:b/>
-          <w:bCs/>
-          <w:u w:val="single"/>
-        </w:rPr>
-        <w:t>Keep questions broad or add specific utility traits</w:t>
-      </w:r>
-      <w:r>
-        <w:rPr>
-          <w:b/>
-          <w:bCs/>
-          <w:u w:val="single"/>
-        </w:rPr>
-        <w:t>?</w:t>
-      </w:r>
-    </w:p>
-    <w:p>
-      <w:pPr>
-        <w:pBdr>
-          <w:bottom w:val="dotted" w:sz="4" w:space="0" w:color="C9C9D2"/>
-        </w:pBdr>
-        <w:spacing w:after="200"/>
-        <w:rPr>
-          <w:rFonts w:ascii="Times New Roman" w:hAnsi="Times New Roman" w:cs="Times New Roman"/>
-        </w:rPr>
-      </w:pPr>
-      <w:r>
-        <w:rPr>
-          <w:rFonts w:ascii="Times New Roman" w:hAnsi="Times New Roman" w:cs="Times New Roman"/>
-        </w:rPr>
-        <w:t>Side A wanted to keep the questions broad to maintain six questions and keep the consultation short. Broad questions are easier for users to answer and reduce the complexity of the recommendation system.</w:t>
-      </w:r>
-    </w:p>
-    <w:p>
-      <w:pPr>
-        <w:pBdr>
-          <w:bottom w:val="dotted" w:sz="4" w:space="0" w:color="C9C9D2"/>
-        </w:pBdr>
-        <w:spacing w:after="200"/>
-        <w:rPr>
-          <w:rFonts w:ascii="Times New Roman" w:hAnsi="Times New Roman" w:cs="Times New Roman"/>
-        </w:rPr>
-      </w:pPr>
-      <w:r>
-        <w:rPr>
-          <w:rFonts w:ascii="Times New Roman" w:hAnsi="Times New Roman" w:cs="Times New Roman"/>
-        </w:rPr>
-        <w:t>Side B wanted to add specific utility traits, such as higher_seating and versatile_cargo, to better differentiate SUVs from Sedans and Wagons. For example, an SUV is suitable for users who prefer higher seating, while a Wagon is more suitable for users who need versatile cargo space.</w:t>
-      </w:r>
-    </w:p>
-    <w:p>
-      <w:pPr>
-        <w:pBdr>
-          <w:bottom w:val="dotted" w:sz="4" w:space="0" w:color="C9C9D2"/>
-        </w:pBdr>
-        <w:spacing w:after="200"/>
-        <w:rPr>
-          <w:rFonts w:ascii="Times New Roman" w:hAnsi="Times New Roman" w:cs="Times New Roman"/>
-        </w:rPr>
-      </w:pPr>
-      <w:r>
-        <w:rPr>
-          <w:rFonts w:ascii="Times New Roman" w:hAnsi="Times New Roman" w:cs="Times New Roman"/>
-        </w:rPr>
-        <w:t>We chose to keep the questions broad to maintain the six-question limit and keep the system simple. However, this creates a known weakness because the system may recommend a Sedan or Wagon when an SUV would better match the user's preferences. With more time, we would add specific utility questions to distinguish these vehicle types more accurately</w:t>
-      </w:r>
-      <w:r>
-        <w:rPr>
-          <w:rFonts w:ascii="Times New Roman" w:hAnsi="Times New Roman" w:cs="Times New Roman"/>
-        </w:rPr>
-        <w:t>.</w:t>
-      </w:r>
-    </w:p>
-    <w:p>
-      <w:pPr>
-        <w:pBdr>
-          <w:bottom w:val="dotted" w:sz="4" w:space="0" w:color="C9C9D2"/>
-        </w:pBdr>
-        <w:spacing w:after="200"/>
-      </w:pPr>
-    </w:p>
-    <w:p>
-      <w:pPr>
-        <w:spacing w:before="270" w:after="70"/>
       </w:pPr>
       <w:r>
         <w:rPr>
@@ -1612,83 +1936,68 @@
           <w:sz w:val="18"/>
           <w:szCs w:val="18"/>
         </w:rPr>
-        <w:t xml:space="preserve">   6 marks · about one page</w:t>
-      </w:r>
-    </w:p>
-    <w:p>
-      <w:pPr>
-        <w:spacing w:after="90"/>
-      </w:pPr>
-      <w:r>
-        <w:rPr>
-          <w:i/>
-          <w:iCs/>
-          <w:color w:val="6A6A7A"/>
-          <w:sz w:val="19"/>
-          <w:szCs w:val="19"/>
-        </w:rPr>
-        <w:t>Describe how you tested, not just that you did. Planned testing scores better than trying a few things at the end.</w:t>
-      </w:r>
-    </w:p>
-    <w:p>
-      <w:pPr>
-        <w:pStyle w:val="ListParagraph"/>
-        <w:numPr>
-          <w:ilvl w:val="0"/>
-          <w:numId w:val="2"/>
-        </w:numPr>
+        <w:t xml:space="preserve">   </w:t>
+      </w:r>
+    </w:p>
+    <w:p>
+      <w:pPr>
         <w:spacing w:after="70"/>
       </w:pPr>
-      <w:r>
-        <w:rPr>
-          <w:i/>
-          <w:iCs/>
-          <w:color w:val="6A6A7A"/>
-          <w:sz w:val="19"/>
-          <w:szCs w:val="19"/>
-        </w:rPr>
-        <w:t>How did you choose what to test? Did you work through every outcome, or test as you built?</w:t>
-      </w:r>
-    </w:p>
-    <w:p>
-      <w:pPr>
-        <w:pStyle w:val="ListParagraph"/>
-        <w:numPr>
-          <w:ilvl w:val="0"/>
-          <w:numId w:val="2"/>
-        </w:numPr>
+    </w:p>
+    <w:p>
+      <w:pPr>
         <w:spacing w:after="70"/>
       </w:pPr>
       <w:r>
-        <w:rPr>
-          <w:i/>
-          <w:iCs/>
-          <w:color w:val="6A6A7A"/>
-          <w:sz w:val="19"/>
-          <w:szCs w:val="19"/>
-        </w:rPr>
-        <w:t>Fill in the table below with your main test cases.</w:t>
+        <w:t>We tested in two stages. While building, we tested each outcome as soon as its rule was written: we answered the questions the way a typical user for that vehicle would, and checked that the system recommended it and gave a sensible explanation. Once all eight outcomes were written, we tested systematically. The system asks six yes/no questions, so there are only 64 possible combinations of answers. We ran every combination and recorded which vehicle each one produced, looking for two problems: an outcome that no combination can reach, and a combination that gets an answer contradicting our own rules.</w:t>
       </w:r>
     </w:p>
     <w:p>
       <w:pPr>
         <w:spacing w:after="70"/>
       </w:pPr>
-    </w:p>
-    <w:p>
-      <w:pPr>
-        <w:spacing w:after="70"/>
-      </w:pPr>
-      <w:r>
-        <w:t>We tested in two stages. While building, we tested each outcome as soon as its rule was written: we answered the questions the way a typical user for that vehicle would, and checked that the system recommended it and gave a sensible explanation. Once all eight outcomes were written, we tested systematically. The system asks six yes/no questions, so there are only 64 possible combinations of answers. We ran every combination and recorded which vehicle each one produced, looking for two problems: an outcome that no combination can reach, and a combination that gets an answer contradicting our own rules.</w:t>
-      </w:r>
-    </w:p>
-    <w:p>
-      <w:pPr>
-        <w:spacing w:after="70"/>
-      </w:pPr>
-      <w:r>
-        <w:t>This found two real bugs. First, Pickup Truck could never be recommended: any user who needed off-road driving and heavy towing matched the SUV rule first, because it sits above the Pickup Truck rule. Second, a user carrying more than five passengers who also wanted easy city parking was recommended a Compact Hatchback, which contradicts our rule that more than five passengers means an MPV. We fixed both by adding exclusions (+ it_is(heavy_hauler) to SUV, + it_is(large_family) to Compact Hatchback), then re-ran all 64 combinations to confirm that all eight outcomes are now reachable.</w:t>
+      <w:r>
+        <w:t xml:space="preserve">This found two real bugs. First, Pickup Truck could never be recommended: any user who needed off-road driving and heavy towing matched the SUV rule first, because it sits above the Pickup Truck rule. Second, a user carrying more than five passengers who also wanted easy city parking was recommended a Compact Hatchback, which contradicts our rule that more than five passengers </w:t>
+      </w:r>
+      <w:proofErr w:type="gramStart"/>
+      <w:r>
+        <w:t>means</w:t>
+      </w:r>
+      <w:proofErr w:type="gramEnd"/>
+      <w:r>
+        <w:t xml:space="preserve"> an MPV. We fixed both by adding exclusions (+ </w:t>
+      </w:r>
+      <w:proofErr w:type="spellStart"/>
+      <w:r>
+        <w:t>it_is</w:t>
+      </w:r>
+      <w:proofErr w:type="spellEnd"/>
+      <w:r>
+        <w:t>(</w:t>
+      </w:r>
+      <w:proofErr w:type="spellStart"/>
+      <w:r>
+        <w:t>heavy_hauler</w:t>
+      </w:r>
+      <w:proofErr w:type="spellEnd"/>
+      <w:r>
+        <w:t xml:space="preserve">) to SUV, + </w:t>
+      </w:r>
+      <w:proofErr w:type="spellStart"/>
+      <w:r>
+        <w:t>it_is</w:t>
+      </w:r>
+      <w:proofErr w:type="spellEnd"/>
+      <w:r>
+        <w:t>(</w:t>
+      </w:r>
+      <w:proofErr w:type="spellStart"/>
+      <w:r>
+        <w:t>large_family</w:t>
+      </w:r>
+      <w:proofErr w:type="spellEnd"/>
+      <w:r>
+        <w:t>) to Compact Hatchback), then re-ran all 64 combinations to confirm that all eight outcomes are now reachable.</w:t>
       </w:r>
     </w:p>
     <w:p>
@@ -1741,7 +2050,6 @@
                 <w:sz w:val="19"/>
                 <w:szCs w:val="19"/>
               </w:rPr>
-              <w:lastRenderedPageBreak/>
               <w:t>what we described to it</w:t>
             </w:r>
           </w:p>
@@ -1990,7 +2298,16 @@
                 <w:sz w:val="19"/>
                 <w:szCs w:val="19"/>
               </w:rPr>
-              <w:t>Wants easy city parking; no EV, no off-road, no towing, no performance, 5 or fewer passengers</w:t>
+              <w:t xml:space="preserve">Wants easy city parking; no EV, no off-road, no towing, no </w:t>
+            </w:r>
+            <w:r>
+              <w:rPr>
+                <w:rFonts w:ascii="Times New Roman" w:hAnsi="Times New Roman" w:cs="Times New Roman"/>
+                <w:sz w:val="19"/>
+                <w:szCs w:val="19"/>
+              </w:rPr>
+              <w:lastRenderedPageBreak/>
+              <w:t>performance, 5 or fewer passengers</w:t>
             </w:r>
           </w:p>
         </w:tc>
@@ -2025,6 +2342,7 @@
                 <w:sz w:val="19"/>
                 <w:szCs w:val="19"/>
               </w:rPr>
+              <w:lastRenderedPageBreak/>
               <w:t>Compact Hatchback</w:t>
             </w:r>
           </w:p>
@@ -2862,8 +3180,6 @@
     <w:p>
       <w:pPr>
         <w:spacing w:before="120" w:after="70"/>
-      </w:pPr>
-      <w:r>
         <w:rPr>
           <w:b/>
           <w:bCs/>
@@ -2871,8 +3187,7 @@
           <w:sz w:val="22"/>
           <w:szCs w:val="22"/>
         </w:rPr>
-        <w:br w:type="textWrapping" w:clear="all"/>
-      </w:r>
+      </w:pPr>
       <w:r>
         <w:rPr>
           <w:b/>
@@ -2881,14 +3196,225 @@
           <w:sz w:val="22"/>
           <w:szCs w:val="22"/>
         </w:rPr>
+        <w:br w:type="textWrapping" w:clear="all"/>
+      </w:r>
+    </w:p>
+    <w:p>
+      <w:pPr>
+        <w:spacing w:before="120" w:after="70"/>
+      </w:pPr>
+      <w:r>
+        <w:rPr>
+          <w:b/>
+          <w:bCs/>
+          <w:color w:val="1E2761"/>
+          <w:sz w:val="22"/>
+          <w:szCs w:val="22"/>
+        </w:rPr>
         <w:t>A case it gets wrong</w:t>
       </w:r>
     </w:p>
     <w:p>
       <w:pPr>
-        <w:spacing w:after="90"/>
-      </w:pPr>
-      <w:r>
+        <w:pBdr>
+          <w:bottom w:val="dotted" w:sz="4" w:space="0" w:color="C9C9D2"/>
+        </w:pBdr>
+        <w:spacing w:after="200"/>
+        <w:rPr>
+          <w:rFonts w:ascii="Times New Roman" w:hAnsi="Times New Roman" w:cs="Times New Roman"/>
+        </w:rPr>
+      </w:pPr>
+      <w:r>
+        <w:rPr>
+          <w:rFonts w:ascii="Times New Roman" w:hAnsi="Times New Roman" w:cs="Times New Roman"/>
+        </w:rPr>
+        <w:t>A user who explicitly wants an SUV (preferring a higher driving position and versatile cargo space for family trips) is incorrectly recommended a Wagon / Estate or falls through to no recommendation at all.</w:t>
+      </w:r>
+    </w:p>
+    <w:p>
+      <w:pPr>
+        <w:pBdr>
+          <w:bottom w:val="dotted" w:sz="4" w:space="0" w:color="C9C9D2"/>
+        </w:pBdr>
+        <w:spacing w:after="200"/>
+        <w:rPr>
+          <w:rFonts w:ascii="Times New Roman" w:hAnsi="Times New Roman" w:cs="Times New Roman"/>
+        </w:rPr>
+      </w:pPr>
+      <w:r>
+        <w:rPr>
+          <w:rFonts w:ascii="Times New Roman" w:hAnsi="Times New Roman" w:cs="Times New Roman"/>
+        </w:rPr>
+        <w:t xml:space="preserve">Why it happens: This is caused by a combination of overlapping rule conditions and strict sequential prioritization. In our initial design, the SUV rule required both </w:t>
+      </w:r>
+      <w:proofErr w:type="spellStart"/>
+      <w:r>
+        <w:rPr>
+          <w:rFonts w:ascii="Times New Roman" w:hAnsi="Times New Roman" w:cs="Times New Roman"/>
+        </w:rPr>
+        <w:t>it_is</w:t>
+      </w:r>
+      <w:proofErr w:type="spellEnd"/>
+      <w:r>
+        <w:rPr>
+          <w:rFonts w:ascii="Times New Roman" w:hAnsi="Times New Roman" w:cs="Times New Roman"/>
+        </w:rPr>
+        <w:t>(</w:t>
+      </w:r>
+      <w:proofErr w:type="spellStart"/>
+      <w:r>
+        <w:rPr>
+          <w:rFonts w:ascii="Times New Roman" w:hAnsi="Times New Roman" w:cs="Times New Roman"/>
+        </w:rPr>
+        <w:t>daily_passenger</w:t>
+      </w:r>
+      <w:proofErr w:type="spellEnd"/>
+      <w:r>
+        <w:rPr>
+          <w:rFonts w:ascii="Times New Roman" w:hAnsi="Times New Roman" w:cs="Times New Roman"/>
+        </w:rPr>
+        <w:t xml:space="preserve">) and </w:t>
+      </w:r>
+      <w:proofErr w:type="spellStart"/>
+      <w:r>
+        <w:rPr>
+          <w:rFonts w:ascii="Times New Roman" w:hAnsi="Times New Roman" w:cs="Times New Roman"/>
+        </w:rPr>
+        <w:t>it_is</w:t>
+      </w:r>
+      <w:proofErr w:type="spellEnd"/>
+      <w:r>
+        <w:rPr>
+          <w:rFonts w:ascii="Times New Roman" w:hAnsi="Times New Roman" w:cs="Times New Roman"/>
+        </w:rPr>
+        <w:t>(</w:t>
+      </w:r>
+      <w:proofErr w:type="spellStart"/>
+      <w:r>
+        <w:rPr>
+          <w:rFonts w:ascii="Times New Roman" w:hAnsi="Times New Roman" w:cs="Times New Roman"/>
+        </w:rPr>
+        <w:t>offroad_capable</w:t>
+      </w:r>
+      <w:proofErr w:type="spellEnd"/>
+      <w:r>
+        <w:rPr>
+          <w:rFonts w:ascii="Times New Roman" w:hAnsi="Times New Roman" w:cs="Times New Roman"/>
+        </w:rPr>
+        <w:t xml:space="preserve">). However, many urban SUV buyers do not drive on rugged, unpaved off-road terrain. Because they answered no to </w:t>
+      </w:r>
+      <w:proofErr w:type="spellStart"/>
+      <w:r>
+        <w:rPr>
+          <w:rFonts w:ascii="Times New Roman" w:hAnsi="Times New Roman" w:cs="Times New Roman"/>
+        </w:rPr>
+        <w:t>offroad_capable</w:t>
+      </w:r>
+      <w:proofErr w:type="spellEnd"/>
+      <w:r>
+        <w:rPr>
+          <w:rFonts w:ascii="Times New Roman" w:hAnsi="Times New Roman" w:cs="Times New Roman"/>
+        </w:rPr>
+        <w:t>, the system failed the SUV rule entirely and instead routed them down to the Wagon or Sedan rules.</w:t>
+      </w:r>
+    </w:p>
+    <w:p>
+      <w:pPr>
+        <w:pBdr>
+          <w:bottom w:val="dotted" w:sz="4" w:space="0" w:color="C9C9D2"/>
+        </w:pBdr>
+        <w:spacing w:after="200"/>
+        <w:rPr>
+          <w:rFonts w:ascii="Times New Roman" w:hAnsi="Times New Roman" w:cs="Times New Roman"/>
+        </w:rPr>
+      </w:pPr>
+      <w:r>
+        <w:rPr>
+          <w:rFonts w:ascii="Times New Roman" w:hAnsi="Times New Roman" w:cs="Times New Roman"/>
+        </w:rPr>
+        <w:t xml:space="preserve">Furthermore, because the Pickup Truck rule also required </w:t>
+      </w:r>
+      <w:proofErr w:type="spellStart"/>
+      <w:r>
+        <w:rPr>
+          <w:rFonts w:ascii="Times New Roman" w:hAnsi="Times New Roman" w:cs="Times New Roman"/>
+        </w:rPr>
+        <w:t>offroad_capable</w:t>
+      </w:r>
+      <w:proofErr w:type="spellEnd"/>
+      <w:r>
+        <w:rPr>
+          <w:rFonts w:ascii="Times New Roman" w:hAnsi="Times New Roman" w:cs="Times New Roman"/>
+        </w:rPr>
+        <w:t xml:space="preserve"> and </w:t>
+      </w:r>
+      <w:proofErr w:type="spellStart"/>
+      <w:r>
+        <w:rPr>
+          <w:rFonts w:ascii="Times New Roman" w:hAnsi="Times New Roman" w:cs="Times New Roman"/>
+        </w:rPr>
+        <w:t>heavy_hauler</w:t>
+      </w:r>
+      <w:proofErr w:type="spellEnd"/>
+      <w:r>
+        <w:rPr>
+          <w:rFonts w:ascii="Times New Roman" w:hAnsi="Times New Roman" w:cs="Times New Roman"/>
+        </w:rPr>
+        <w:t xml:space="preserve">, and sat above or interacted tightly with cargo rules, users wanting versatile utility without extreme off-roading were completely starved of an SUV recommendation. This revealed a flaw in our initial domain </w:t>
+      </w:r>
+      <w:proofErr w:type="spellStart"/>
+      <w:r>
+        <w:rPr>
+          <w:rFonts w:ascii="Times New Roman" w:hAnsi="Times New Roman" w:cs="Times New Roman"/>
+        </w:rPr>
+        <w:t>modeling</w:t>
+      </w:r>
+      <w:proofErr w:type="spellEnd"/>
+      <w:r>
+        <w:rPr>
+          <w:rFonts w:ascii="Times New Roman" w:hAnsi="Times New Roman" w:cs="Times New Roman"/>
+        </w:rPr>
+        <w:t>: treating off-road capability as a mandatory gatekeeper for an SUV prevented everyday family crossover/SUV buyers from ever reaching the outcome. (Note: To truly fix this in a future iteration, the SUV rule should decouple off-road capability from general SUV classification, introducing dedicated questions for seating position and everyday cargo versatility)</w:t>
+      </w:r>
+      <w:r>
+        <w:rPr>
+          <w:rFonts w:ascii="Times New Roman" w:hAnsi="Times New Roman" w:cs="Times New Roman"/>
+        </w:rPr>
+        <w:t>.</w:t>
+      </w:r>
+    </w:p>
+    <w:p>
+      <w:pPr>
+        <w:pBdr>
+          <w:bottom w:val="dotted" w:sz="4" w:space="0" w:color="C9C9D2"/>
+        </w:pBdr>
+        <w:spacing w:after="200"/>
+      </w:pPr>
+    </w:p>
+    <w:p>
+      <w:pPr>
+        <w:pBdr>
+          <w:bottom w:val="dotted" w:sz="4" w:space="0" w:color="C9C9D2"/>
+        </w:pBdr>
+        <w:spacing w:after="200"/>
+      </w:pPr>
+    </w:p>
+    <w:p>
+      <w:pPr>
+        <w:pBdr>
+          <w:bottom w:val="dotted" w:sz="4" w:space="0" w:color="C9C9D2"/>
+        </w:pBdr>
+        <w:spacing w:after="200"/>
+      </w:pPr>
+    </w:p>
+    <w:p>
+      <w:pPr>
+        <w:pageBreakBefore/>
+      </w:pPr>
+    </w:p>
+    <w:p>
+      <w:pPr>
+        <w:spacing w:before="270" w:after="70"/>
         <w:rPr>
           <w:i/>
           <w:iCs/>
@@ -2896,7 +3422,24 @@
           <w:sz w:val="19"/>
           <w:szCs w:val="19"/>
         </w:rPr>
-        <w:t>Required. Describe one case your system handles badly, and say why it happens. Is it a missing rule, two rules that overlap, or a question you never ask? A group that finds a real weakness scores better than one that claims it has none.</w:t>
+      </w:pPr>
+      <w:r>
+        <w:rPr>
+          <w:b/>
+          <w:bCs/>
+          <w:color w:val="1E2761"/>
+          <w:sz w:val="26"/>
+          <w:szCs w:val="26"/>
+        </w:rPr>
+        <w:t>5. What we would do with another three weeks</w:t>
+      </w:r>
+      <w:r>
+        <w:rPr>
+          <w:color w:val="6A6A7A"/>
+          <w:sz w:val="18"/>
+          <w:szCs w:val="18"/>
+        </w:rPr>
+        <w:t xml:space="preserve">   </w:t>
       </w:r>
     </w:p>
     <w:p>
@@ -2906,9 +3449,47 @@
         </w:pBdr>
         <w:spacing w:after="200"/>
         <w:rPr>
-          <w:rFonts w:ascii="Times New Roman" w:hAnsi="Times New Roman" w:cs="Times New Roman"/>
-        </w:rPr>
-      </w:pPr>
+          <w:bCs/>
+        </w:rPr>
+      </w:pPr>
+      <w:r>
+        <w:rPr>
+          <w:bCs/>
+        </w:rPr>
+        <w:t xml:space="preserve">According to the test case table, we can see current system is unable to recommend SUV to user when they </w:t>
+      </w:r>
+      <w:proofErr w:type="gramStart"/>
+      <w:r>
+        <w:rPr>
+          <w:bCs/>
+        </w:rPr>
+        <w:t>p</w:t>
+      </w:r>
+      <w:r>
+        <w:rPr>
+          <w:bCs/>
+        </w:rPr>
+        <w:t>refers</w:t>
+      </w:r>
+      <w:proofErr w:type="gramEnd"/>
+      <w:r>
+        <w:rPr>
+          <w:bCs/>
+        </w:rPr>
+        <w:t xml:space="preserve"> higher seating and needs 5 or fewer passengers.</w:t>
+      </w:r>
+      <w:r>
+        <w:rPr>
+          <w:bCs/>
+        </w:rPr>
+        <w:t xml:space="preserve"> So, w</w:t>
+      </w:r>
+      <w:r>
+        <w:rPr>
+          <w:bCs/>
+        </w:rPr>
+        <w:t>ith another three weeks, we would implement two major architectural refinements to improve classification accuracy and eliminate rule ambiguities:</w:t>
+      </w:r>
     </w:p>
     <w:p>
       <w:pPr>
@@ -2917,14 +3498,14 @@
         </w:pBdr>
         <w:spacing w:after="200"/>
         <w:rPr>
-          <w:rFonts w:ascii="Times New Roman" w:hAnsi="Times New Roman" w:cs="Times New Roman"/>
-        </w:rPr>
-      </w:pPr>
-      <w:r>
-        <w:rPr>
-          <w:rFonts w:ascii="Times New Roman" w:hAnsi="Times New Roman" w:cs="Times New Roman"/>
-        </w:rPr>
-        <w:t>A user who explicitly wants an SUV (preferring a higher driving position and versatile cargo space for family trips) is incorrectly recommended a Wagon / Estate or falls through to no recommendation at all.</w:t>
+          <w:b/>
+        </w:rPr>
+      </w:pPr>
+      <w:r>
+        <w:rPr>
+          <w:b/>
+        </w:rPr>
+        <w:t>1. Decouple Cargo Space from Heavy Towing via Fine-Grained Questions</w:t>
       </w:r>
     </w:p>
     <w:p>
@@ -2934,14 +3515,76 @@
         </w:pBdr>
         <w:spacing w:after="200"/>
         <w:rPr>
-          <w:rFonts w:ascii="Times New Roman" w:hAnsi="Times New Roman" w:cs="Times New Roman"/>
-        </w:rPr>
-      </w:pPr>
-      <w:r>
-        <w:rPr>
-          <w:rFonts w:ascii="Times New Roman" w:hAnsi="Times New Roman" w:cs="Times New Roman"/>
-        </w:rPr>
-        <w:t>Why it happens: This is caused by a combination of overlapping rule conditions and strict sequential prioritization. In our initial design, the SUV rule required both it_is(daily_passenger) and it_is(offroad_capable). However, many urban SUV buyers do not drive on rugged, unpaved off-road terrain. Because they answered no to offroad_capable, the system failed the SUV rule entirely and instead routed them down to the Wagon or Sedan rules.</w:t>
+          <w:bCs/>
+        </w:rPr>
+      </w:pPr>
+      <w:r>
+        <w:rPr>
+          <w:bCs/>
+        </w:rPr>
+        <w:t xml:space="preserve">- </w:t>
+      </w:r>
+      <w:r>
+        <w:rPr>
+          <w:bCs/>
+        </w:rPr>
+        <w:t xml:space="preserve">What we would change: Replace our single broad </w:t>
+      </w:r>
+      <w:proofErr w:type="spellStart"/>
+      <w:r>
+        <w:rPr>
+          <w:bCs/>
+        </w:rPr>
+        <w:t>heavy_hauler</w:t>
+      </w:r>
+      <w:proofErr w:type="spellEnd"/>
+      <w:r>
+        <w:rPr>
+          <w:bCs/>
+        </w:rPr>
+        <w:t xml:space="preserve"> question with two distinct middle-layer queries: </w:t>
+      </w:r>
+      <w:proofErr w:type="spellStart"/>
+      <w:r>
+        <w:rPr>
+          <w:bCs/>
+        </w:rPr>
+        <w:t>versatile_cargo</w:t>
+      </w:r>
+      <w:proofErr w:type="spellEnd"/>
+      <w:r>
+        <w:rPr>
+          <w:bCs/>
+        </w:rPr>
+        <w:t xml:space="preserve"> (for luggage, groceries, and large everyday items) and </w:t>
+      </w:r>
+      <w:proofErr w:type="spellStart"/>
+      <w:r>
+        <w:rPr>
+          <w:bCs/>
+        </w:rPr>
+        <w:t>heavy_hauler</w:t>
+      </w:r>
+      <w:proofErr w:type="spellEnd"/>
+      <w:r>
+        <w:rPr>
+          <w:bCs/>
+        </w:rPr>
+        <w:t xml:space="preserve"> (specifically for towing trailers, boats, or heavy loads). Furthermore, we would introduce a </w:t>
+      </w:r>
+      <w:proofErr w:type="spellStart"/>
+      <w:r>
+        <w:rPr>
+          <w:bCs/>
+        </w:rPr>
+        <w:t>higher_seating</w:t>
+      </w:r>
+      <w:proofErr w:type="spellEnd"/>
+      <w:r>
+        <w:rPr>
+          <w:bCs/>
+        </w:rPr>
+        <w:t xml:space="preserve"> preference predicate.</w:t>
       </w:r>
     </w:p>
     <w:p>
@@ -2951,20 +3594,20 @@
         </w:pBdr>
         <w:spacing w:after="200"/>
         <w:rPr>
-          <w:rFonts w:ascii="Times New Roman" w:hAnsi="Times New Roman" w:cs="Times New Roman"/>
-        </w:rPr>
-      </w:pPr>
-      <w:r>
-        <w:rPr>
-          <w:rFonts w:ascii="Times New Roman" w:hAnsi="Times New Roman" w:cs="Times New Roman"/>
-        </w:rPr>
-        <w:t>Furthermore, because the Pickup Truck rule also required offroad_capable and heavy_hauler, and sat above or interacted tightly with cargo rules, users wanting versatile utility without extreme off-roading were completely starved of an SUV recommendation. This revealed a flaw in our initial domain modeling: treating off-road capability as a mandatory gatekeeper for an SUV prevented everyday family crossover/SUV buyers from ever reaching the outcome. (Note: To truly fix this in a future iteration, the SUV rule should decouple off-road capability from general SUV classification, introducing dedicated questions for seating position and everyday cargo versatility)</w:t>
-      </w:r>
-      <w:r>
-        <w:rPr>
-          <w:rFonts w:ascii="Times New Roman" w:hAnsi="Times New Roman" w:cs="Times New Roman"/>
-        </w:rPr>
-        <w:t>.</w:t>
+          <w:bCs/>
+        </w:rPr>
+      </w:pPr>
+      <w:r>
+        <w:rPr>
+          <w:bCs/>
+        </w:rPr>
+        <w:t xml:space="preserve">- </w:t>
+      </w:r>
+      <w:r>
+        <w:rPr>
+          <w:bCs/>
+        </w:rPr>
+        <w:t>What it would fix: This directly resolves the weakness where users needing cargo space without off-road capabilities get misrouted to a Wagon. It allows the system to clearly differentiate between an urban family lifestyle (SUV), a utility lifestyle (Pickup Truck), and an everyday commuter lifestyle (Sedan/Wagon) without relying on restrictive off-road prerequisites.</w:t>
       </w:r>
     </w:p>
     <w:p>
@@ -2973,7 +3616,16 @@
           <w:bottom w:val="dotted" w:sz="4" w:space="0" w:color="C9C9D2"/>
         </w:pBdr>
         <w:spacing w:after="200"/>
-      </w:pPr>
+        <w:rPr>
+          <w:b/>
+        </w:rPr>
+      </w:pPr>
+      <w:r>
+        <w:rPr>
+          <w:b/>
+        </w:rPr>
+        <w:t>2. Refine Top-Tier Rule Precedence and Mutual Exclusivity</w:t>
+      </w:r>
     </w:p>
     <w:p>
       <w:pPr>
@@ -2981,7 +3633,22 @@
           <w:bottom w:val="dotted" w:sz="4" w:space="0" w:color="C9C9D2"/>
         </w:pBdr>
         <w:spacing w:after="200"/>
-      </w:pPr>
+        <w:rPr>
+          <w:bCs/>
+        </w:rPr>
+      </w:pPr>
+      <w:r>
+        <w:rPr>
+          <w:bCs/>
+        </w:rPr>
+        <w:t xml:space="preserve">- </w:t>
+      </w:r>
+      <w:r>
+        <w:rPr>
+          <w:bCs/>
+        </w:rPr>
+        <w:t>What we would change: Restructure the top-level outcome conditions (recommend/1) using explicit negative constraints (\+) across overlapping categories, ensuring that crossover vehicles like SUVs can be recommended to drivers who prefer higher seating and cargo space even if they answer no to off-road terrain.</w:t>
+      </w:r>
     </w:p>
     <w:p>
       <w:pPr>
@@ -2989,41 +3656,34 @@
           <w:bottom w:val="dotted" w:sz="4" w:space="0" w:color="C9C9D2"/>
         </w:pBdr>
         <w:spacing w:after="200"/>
-      </w:pPr>
-    </w:p>
-    <w:p>
-      <w:pPr>
-        <w:pageBreakBefore/>
+        <w:rPr>
+          <w:bCs/>
+        </w:rPr>
+      </w:pPr>
+      <w:r>
+        <w:rPr>
+          <w:bCs/>
+        </w:rPr>
+        <w:t xml:space="preserve">- </w:t>
+      </w:r>
+      <w:r>
+        <w:rPr>
+          <w:bCs/>
+        </w:rPr>
+        <w:t>What it would fix: This prevents urban SUVs from being entirely starved of recommendations when users do not drive off-road, making the expert system far more robust and commercially realistic for everyday drivers.</w:t>
+      </w:r>
+    </w:p>
+    <w:p>
+      <w:pPr>
+        <w:pBdr>
+          <w:bottom w:val="dotted" w:sz="4" w:space="0" w:color="C9C9D2"/>
+        </w:pBdr>
+        <w:spacing w:after="200"/>
       </w:pPr>
     </w:p>
     <w:p>
       <w:pPr>
         <w:spacing w:before="270" w:after="70"/>
-      </w:pPr>
-      <w:r>
-        <w:rPr>
-          <w:b/>
-          <w:bCs/>
-          <w:color w:val="1E2761"/>
-          <w:sz w:val="26"/>
-          <w:szCs w:val="26"/>
-        </w:rPr>
-        <w:t>5. What we would do with another three weeks</w:t>
-      </w:r>
-      <w:r>
-        <w:rPr>
-          <w:color w:val="6A6A7A"/>
-          <w:sz w:val="18"/>
-          <w:szCs w:val="18"/>
-        </w:rPr>
-        <w:t xml:space="preserve">   4 marks · about quarter of a page</w:t>
-      </w:r>
-    </w:p>
-    <w:p>
-      <w:pPr>
-        <w:spacing w:after="90"/>
-      </w:pPr>
-      <w:r>
         <w:rPr>
           <w:i/>
           <w:iCs/>
@@ -3031,329 +3691,134 @@
           <w:sz w:val="19"/>
           <w:szCs w:val="19"/>
         </w:rPr>
-        <w:t>Be specific. “More rules” and “a better interface” score nothing. Name the thing you would change and say what it would fix.</w:t>
-      </w:r>
-    </w:p>
-    <w:p>
-      <w:pPr>
+      </w:pPr>
+      <w:r>
+        <w:rPr>
+          <w:b/>
+          <w:bCs/>
+          <w:color w:val="1E2761"/>
+          <w:sz w:val="24"/>
+          <w:szCs w:val="24"/>
+        </w:rPr>
+        <w:t>Use of AI assistants</w:t>
+      </w:r>
+    </w:p>
+    <w:p>
+      <w:pPr>
+        <w:pStyle w:val="ListParagraph"/>
+        <w:numPr>
+          <w:ilvl w:val="0"/>
+          <w:numId w:val="7"/>
+        </w:numPr>
         <w:pBdr>
           <w:bottom w:val="dotted" w:sz="4" w:space="0" w:color="C9C9D2"/>
         </w:pBdr>
         <w:spacing w:after="200"/>
-        <w:rPr>
-          <w:bCs/>
-        </w:rPr>
-      </w:pPr>
-      <w:r>
-        <w:rPr>
-          <w:bCs/>
-        </w:rPr>
-        <w:t>According to the test case table, we can see current system is unable to recommend SUV to user when they p</w:t>
-      </w:r>
-      <w:r>
-        <w:rPr>
-          <w:bCs/>
-        </w:rPr>
-        <w:t>refers higher seating and needs 5 or fewer passengers.</w:t>
-      </w:r>
-      <w:r>
-        <w:rPr>
-          <w:bCs/>
-        </w:rPr>
-        <w:t xml:space="preserve"> So, w</w:t>
-      </w:r>
-      <w:r>
-        <w:rPr>
-          <w:bCs/>
-        </w:rPr>
-        <w:t>ith another three weeks, we would implement two major architectural refinements to improve classification accuracy and eliminate rule ambiguities:</w:t>
-      </w:r>
-    </w:p>
-    <w:p>
-      <w:pPr>
+      </w:pPr>
+      <w:r>
+        <w:rPr>
+          <w:b/>
+          <w:bCs/>
+        </w:rPr>
+        <w:t>Did you use one?</w:t>
+      </w:r>
+      <w:r>
+        <w:t xml:space="preserve"> Yes.</w:t>
+      </w:r>
+    </w:p>
+    <w:p>
+      <w:pPr>
+        <w:pStyle w:val="ListParagraph"/>
+        <w:numPr>
+          <w:ilvl w:val="0"/>
+          <w:numId w:val="7"/>
+        </w:numPr>
         <w:pBdr>
           <w:bottom w:val="dotted" w:sz="4" w:space="0" w:color="C9C9D2"/>
         </w:pBdr>
         <w:spacing w:after="200"/>
+      </w:pPr>
+      <w:r>
         <w:rPr>
           <w:b/>
-        </w:rPr>
-      </w:pPr>
-      <w:r>
-        <w:rPr>
-          <w:b/>
-        </w:rPr>
-        <w:t>1. Decouple Cargo Space from Heavy Towing via Fine-Grained Questions</w:t>
-      </w:r>
-    </w:p>
-    <w:p>
-      <w:pPr>
+          <w:bCs/>
+        </w:rPr>
+        <w:t>What you used it for:</w:t>
+      </w:r>
+      <w:r>
+        <w:t xml:space="preserve"> Checked </w:t>
+      </w:r>
+      <w:proofErr w:type="spellStart"/>
+      <w:r>
+        <w:t>Prolog</w:t>
+      </w:r>
+      <w:proofErr w:type="spellEnd"/>
+      <w:r>
+        <w:t xml:space="preserve"> code logic; assisted in learning and understanding </w:t>
+      </w:r>
+      <w:proofErr w:type="spellStart"/>
+      <w:r>
+        <w:t>Prolog</w:t>
+      </w:r>
+      <w:proofErr w:type="spellEnd"/>
+      <w:r>
+        <w:t xml:space="preserve"> concepts, including format control sequences (~n, ~w), built-in predicates (</w:t>
+      </w:r>
+      <w:proofErr w:type="spellStart"/>
+      <w:r>
+        <w:t>flush_output</w:t>
+      </w:r>
+      <w:proofErr w:type="spellEnd"/>
+      <w:r>
+        <w:t xml:space="preserve">/0, </w:t>
+      </w:r>
+      <w:proofErr w:type="spellStart"/>
+      <w:r>
+        <w:t>assertz</w:t>
+      </w:r>
+      <w:proofErr w:type="spellEnd"/>
+      <w:r>
+        <w:t xml:space="preserve">/1, </w:t>
+      </w:r>
+      <w:proofErr w:type="spellStart"/>
+      <w:r>
+        <w:t>retractall</w:t>
+      </w:r>
+      <w:proofErr w:type="spellEnd"/>
+      <w:r>
+        <w:t>/1), and rule definition syntax (start :-); and assisted with debugging errors.</w:t>
+      </w:r>
+    </w:p>
+    <w:p>
+      <w:pPr>
+        <w:pStyle w:val="ListParagraph"/>
+        <w:numPr>
+          <w:ilvl w:val="0"/>
+          <w:numId w:val="7"/>
+        </w:numPr>
         <w:pBdr>
           <w:bottom w:val="dotted" w:sz="4" w:space="0" w:color="C9C9D2"/>
         </w:pBdr>
         <w:spacing w:after="200"/>
-        <w:rPr>
-          <w:bCs/>
-        </w:rPr>
-      </w:pPr>
-      <w:r>
-        <w:rPr>
-          <w:bCs/>
-        </w:rPr>
-        <w:t xml:space="preserve">- </w:t>
-      </w:r>
-      <w:r>
-        <w:rPr>
-          <w:bCs/>
-        </w:rPr>
-        <w:t>What we would change: Replace our single broad heavy_hauler question with two distinct middle-layer queries: versatile_cargo (for luggage, groceries, and large everyday items) and heavy_hauler (specifically for towing trailers, boats, or heavy loads). Furthermore, we would introduce a higher_seating preference predicate.</w:t>
-      </w:r>
-    </w:p>
-    <w:p>
-      <w:pPr>
-        <w:pBdr>
-          <w:bottom w:val="dotted" w:sz="4" w:space="0" w:color="C9C9D2"/>
-        </w:pBdr>
-        <w:spacing w:after="200"/>
-        <w:rPr>
-          <w:bCs/>
-        </w:rPr>
-      </w:pPr>
-      <w:r>
-        <w:rPr>
-          <w:bCs/>
-        </w:rPr>
-        <w:t xml:space="preserve">- </w:t>
-      </w:r>
-      <w:r>
-        <w:rPr>
-          <w:bCs/>
-        </w:rPr>
-        <w:t>What it would fix: This directly resolves the weakness where users needing cargo space without off-road capabilities get misrouted to a Wagon. It allows the system to clearly differentiate between an urban family lifestyle (SUV), a utility lifestyle (Pickup Truck), and an everyday commuter lifestyle (Sedan/Wagon) without relying on restrictive off-road prerequisites.</w:t>
-      </w:r>
-    </w:p>
-    <w:p>
-      <w:pPr>
-        <w:pBdr>
-          <w:bottom w:val="dotted" w:sz="4" w:space="0" w:color="C9C9D2"/>
-        </w:pBdr>
-        <w:spacing w:after="200"/>
+      </w:pPr>
+      <w:r>
         <w:rPr>
           <w:b/>
-        </w:rPr>
-      </w:pPr>
-      <w:r>
-        <w:rPr>
-          <w:b/>
-        </w:rPr>
-        <w:t>2. Refine Top-Tier Rule Precedence and Mutual Exclusivity</w:t>
-      </w:r>
-    </w:p>
-    <w:p>
-      <w:pPr>
-        <w:pBdr>
-          <w:bottom w:val="dotted" w:sz="4" w:space="0" w:color="C9C9D2"/>
-        </w:pBdr>
-        <w:spacing w:after="200"/>
-        <w:rPr>
-          <w:bCs/>
-        </w:rPr>
-      </w:pPr>
-      <w:r>
-        <w:rPr>
-          <w:bCs/>
-        </w:rPr>
-        <w:t xml:space="preserve">- </w:t>
-      </w:r>
-      <w:r>
-        <w:rPr>
-          <w:bCs/>
-        </w:rPr>
-        <w:t>What we would change: Restructure the top-level outcome conditions (recommend/1) using explicit negative constraints (\+) across overlapping categories, ensuring that crossover vehicles like SUVs can be recommended to drivers who prefer higher seating and cargo space even if they answer no to off-road terrain.</w:t>
-      </w:r>
-    </w:p>
-    <w:p>
-      <w:pPr>
-        <w:pBdr>
-          <w:bottom w:val="dotted" w:sz="4" w:space="0" w:color="C9C9D2"/>
-        </w:pBdr>
-        <w:spacing w:after="200"/>
-        <w:rPr>
-          <w:bCs/>
-        </w:rPr>
-      </w:pPr>
-      <w:r>
-        <w:rPr>
-          <w:bCs/>
-        </w:rPr>
-        <w:t xml:space="preserve">- </w:t>
-      </w:r>
-      <w:r>
-        <w:rPr>
-          <w:bCs/>
-        </w:rPr>
-        <w:t>What it would fix: This prevents urban SUVs from being entirely starved of recommendations when users do not drive off-road, making the expert system far more robust and commercially realistic for everyday drivers.</w:t>
-      </w:r>
-    </w:p>
-    <w:p>
-      <w:pPr>
-        <w:pBdr>
-          <w:bottom w:val="dotted" w:sz="4" w:space="0" w:color="C9C9D2"/>
-        </w:pBdr>
-        <w:spacing w:after="200"/>
-      </w:pPr>
-    </w:p>
-    <w:p>
-      <w:pPr>
-        <w:spacing w:before="270" w:after="70"/>
-      </w:pPr>
-      <w:r>
-        <w:rPr>
-          <w:b/>
-          <w:bCs/>
-          <w:color w:val="1E2761"/>
-          <w:sz w:val="24"/>
-          <w:szCs w:val="24"/>
-        </w:rPr>
-        <w:t>Use of AI assistants</w:t>
-      </w:r>
-      <w:r>
-        <w:rPr>
-          <w:color w:val="6A6A7A"/>
-          <w:sz w:val="18"/>
-          <w:szCs w:val="18"/>
-        </w:rPr>
-        <w:t xml:space="preserve">   not marked, but required</w:t>
-      </w:r>
-    </w:p>
-    <w:p>
-      <w:pPr>
-        <w:spacing w:after="90"/>
-      </w:pPr>
-      <w:r>
-        <w:rPr>
-          <w:i/>
-          <w:iCs/>
-          <w:color w:val="6A6A7A"/>
-          <w:sz w:val="19"/>
-          <w:szCs w:val="19"/>
-        </w:rPr>
-        <w:t>Say whether you used one, what you used it for, and what you changed. If you did not use one, write “none”. Using one is allowed; passing its work off as your own design is not.</w:t>
-      </w:r>
-    </w:p>
-    <w:p>
-      <w:pPr>
-        <w:pBdr>
-          <w:bottom w:val="dotted" w:sz="4" w:space="0" w:color="C9C9D2"/>
-        </w:pBdr>
-        <w:spacing w:after="200"/>
-      </w:pPr>
-    </w:p>
-    <w:p>
-      <w:pPr>
-        <w:pBdr>
-          <w:bottom w:val="dotted" w:sz="4" w:space="0" w:color="C9C9D2"/>
-        </w:pBdr>
-        <w:spacing w:after="200"/>
-      </w:pPr>
-      <w:r>
-        <w:t>Check the prolog code logic</w:t>
-      </w:r>
-    </w:p>
-    <w:p>
-      <w:pPr>
-        <w:pBdr>
-          <w:bottom w:val="dotted" w:sz="4" w:space="0" w:color="C9C9D2"/>
-        </w:pBdr>
-        <w:spacing w:after="200"/>
-      </w:pPr>
-      <w:r>
-        <w:t>Assist to learn and understand some prolog knowledge</w:t>
-      </w:r>
-      <w:r>
-        <w:t xml:space="preserve">s, </w:t>
-      </w:r>
-      <w:r>
-        <w:t>Built-in predicate</w:t>
-      </w:r>
-      <w:r>
-        <w:t xml:space="preserve">, </w:t>
-      </w:r>
-      <w:r>
-        <w:t>Library predicate</w:t>
-      </w:r>
-      <w:r>
-        <w:t xml:space="preserve">, </w:t>
-      </w:r>
-      <w:r>
-        <w:t>Format control sequence</w:t>
-      </w:r>
-      <w:r>
-        <w:t xml:space="preserve"> and </w:t>
-      </w:r>
-      <w:r>
-        <w:t>Rule definition syntax</w:t>
-      </w:r>
+          <w:bCs/>
+        </w:rPr>
+        <w:t>What you changed:</w:t>
+      </w:r>
+      <w:r>
+        <w:t xml:space="preserve"> Reviewed, verified, and adapted the suggested logic and syntax to fit the specific requirements of the assignment, and adjusted the formatting outputs to match the expected program </w:t>
+      </w:r>
+      <w:proofErr w:type="spellStart"/>
+      <w:r>
+        <w:t>behavior</w:t>
+      </w:r>
+      <w:proofErr w:type="spellEnd"/>
       <w:r>
         <w:t>.</w:t>
       </w:r>
-    </w:p>
-    <w:p>
-      <w:pPr>
-        <w:pBdr>
-          <w:bottom w:val="dotted" w:sz="4" w:space="0" w:color="C9C9D2"/>
-        </w:pBdr>
-        <w:spacing w:after="200"/>
-      </w:pPr>
-      <w:r>
-        <w:rPr>
-          <w:noProof/>
-        </w:rPr>
-        <w:lastRenderedPageBreak/>
-        <w:drawing>
-          <wp:inline distT="0" distB="0" distL="0" distR="0" wp14:anchorId="389D5014" wp14:editId="0F2D61D3">
-            <wp:extent cx="6311900" cy="2895600"/>
-            <wp:effectExtent l="0" t="0" r="0" b="0"/>
-            <wp:docPr id="466051771" name="Picture 1"/>
-            <wp:cNvGraphicFramePr>
-              <a:graphicFrameLocks xmlns:a="http://schemas.openxmlformats.org/drawingml/2006/main" noChangeAspect="1"/>
-            </wp:cNvGraphicFramePr>
-            <a:graphic xmlns:a="http://schemas.openxmlformats.org/drawingml/2006/main">
-              <a:graphicData uri="http://schemas.openxmlformats.org/drawingml/2006/picture">
-                <pic:pic xmlns:pic="http://schemas.openxmlformats.org/drawingml/2006/picture">
-                  <pic:nvPicPr>
-                    <pic:cNvPr id="466051771" name=""/>
-                    <pic:cNvPicPr/>
-                  </pic:nvPicPr>
-                  <pic:blipFill>
-                    <a:blip r:embed="rId13"/>
-                    <a:stretch>
-                      <a:fillRect/>
-                    </a:stretch>
-                  </pic:blipFill>
-                  <pic:spPr>
-                    <a:xfrm>
-                      <a:off x="0" y="0"/>
-                      <a:ext cx="6311900" cy="2895600"/>
-                    </a:xfrm>
-                    <a:prstGeom prst="rect">
-                      <a:avLst/>
-                    </a:prstGeom>
-                  </pic:spPr>
-                </pic:pic>
-              </a:graphicData>
-            </a:graphic>
-          </wp:inline>
-        </w:drawing>
-      </w:r>
-    </w:p>
-    <w:p>
-      <w:pPr>
-        <w:pBdr>
-          <w:bottom w:val="dotted" w:sz="4" w:space="0" w:color="C9C9D2"/>
-        </w:pBdr>
-        <w:spacing w:after="200"/>
-      </w:pPr>
     </w:p>
     <w:p>
       <w:pPr>
@@ -3457,8 +3922,8 @@
       </w:r>
     </w:p>
     <w:sectPr>
-      <w:footerReference w:type="even" r:id="rId14"/>
-      <w:footerReference w:type="default" r:id="rId15"/>
+      <w:footerReference w:type="even" r:id="rId13"/>
+      <w:footerReference w:type="default" r:id="rId14"/>
       <w:pgSz w:w="12240" w:h="15840"/>
       <w:pgMar w:top="950" w:right="1150" w:bottom="950" w:left="1150" w:header="708" w:footer="708" w:gutter="0"/>
       <w:cols w:space="720"/>
@@ -3747,7 +4212,7 @@
   <w:abstractNum w:abstractNumId="1" w15:restartNumberingAfterBreak="0">
     <w:nsid w:val="30A01AB1"/>
     <w:multiLevelType w:val="hybridMultilevel"/>
-    <w:tmpl w:val="EDDE0B3E"/>
+    <w:tmpl w:val="D850F690"/>
     <w:lvl w:ilvl="0" w:tplc="04090001">
       <w:start w:val="1"/>
       <w:numFmt w:val="bullet"/>
@@ -5045,6 +5510,46 @@
     <w:unhideWhenUsed/>
     <w:rsid w:val="0004069F"/>
   </w:style>
+  <w:style w:type="paragraph" w:styleId="Header">
+    <w:name w:val="header"/>
+    <w:basedOn w:val="Normal"/>
+    <w:link w:val="HeaderChar"/>
+    <w:uiPriority w:val="99"/>
+    <w:unhideWhenUsed/>
+    <w:rsid w:val="004D6054"/>
+    <w:pPr>
+      <w:tabs>
+        <w:tab w:val="center" w:pos="4680"/>
+        <w:tab w:val="right" w:pos="9360"/>
+      </w:tabs>
+    </w:pPr>
+  </w:style>
+  <w:style w:type="character" w:customStyle="1" w:styleId="HeaderChar">
+    <w:name w:val="Header Char"/>
+    <w:basedOn w:val="DefaultParagraphFont"/>
+    <w:link w:val="Header"/>
+    <w:uiPriority w:val="99"/>
+    <w:rsid w:val="004D6054"/>
+  </w:style>
+  <w:style w:type="paragraph" w:styleId="Caption">
+    <w:name w:val="caption"/>
+    <w:basedOn w:val="Normal"/>
+    <w:next w:val="Normal"/>
+    <w:uiPriority w:val="35"/>
+    <w:unhideWhenUsed/>
+    <w:qFormat/>
+    <w:rsid w:val="00D85291"/>
+    <w:pPr>
+      <w:spacing w:after="200"/>
+    </w:pPr>
+    <w:rPr>
+      <w:i/>
+      <w:iCs/>
+      <w:color w:val="0E2841" w:themeColor="text2"/>
+      <w:sz w:val="18"/>
+      <w:szCs w:val="18"/>
+    </w:rPr>
+  </w:style>
 </w:styles>
 </file>
 

</xml_diff>